<commit_message>
kubernetes - workloads - deployment intro updated
</commit_message>
<xml_diff>
--- a/Kubernetes/concepts/11-networking.docx
+++ b/Kubernetes/concepts/11-networking.docx
@@ -2,6 +2,139 @@
 <file path=word/document.xml><?xml version="1.0" encoding="utf-8"?>
 <w:document xmlns:wpc="http://schemas.microsoft.com/office/word/2010/wordprocessingCanvas" xmlns:cx="http://schemas.microsoft.com/office/drawing/2014/chartex" xmlns:cx1="http://schemas.microsoft.com/office/drawing/2015/9/8/chartex" xmlns:cx2="http://schemas.microsoft.com/office/drawing/2015/10/21/chartex" xmlns:cx3="http://schemas.microsoft.com/office/drawing/2016/5/9/chartex" xmlns:cx4="http://schemas.microsoft.com/office/drawing/2016/5/10/chartex" xmlns:cx5="http://schemas.microsoft.com/office/drawing/2016/5/11/chartex" xmlns:cx6="http://schemas.microsoft.com/office/drawing/2016/5/12/chartex" xmlns:cx7="http://schemas.microsoft.com/office/drawing/2016/5/13/chartex" xmlns:cx8="http://schemas.microsoft.com/office/drawing/2016/5/14/chartex" xmlns:mc="http://schemas.openxmlformats.org/markup-compatibility/2006" xmlns:aink="http://schemas.microsoft.com/office/drawing/2016/ink" xmlns:am3d="http://schemas.microsoft.com/office/drawing/2017/model3d" xmlns:o="urn:schemas-microsoft-com:office:office" xmlns:oel="http://schemas.microsoft.com/office/2019/extlst" xmlns:r="http://schemas.openxmlformats.org/officeDocument/2006/relationships" xmlns:m="http://schemas.openxmlformats.org/officeDocument/2006/math" xmlns:v="urn:schemas-microsoft-com:vml" xmlns:wp14="http://schemas.microsoft.com/office/word/2010/wordprocessingDrawing" xmlns:wp="http://schemas.openxmlformats.org/drawingml/2006/wordprocessingDrawing" xmlns:w10="urn:schemas-microsoft-com:office:word" xmlns:w="http://schemas.openxmlformats.org/wordprocessingml/2006/main" xmlns:w14="http://schemas.microsoft.com/office/word/2010/wordml" xmlns:w15="http://schemas.microsoft.com/office/word/2012/wordml" xmlns:w16cex="http://schemas.microsoft.com/office/word/2018/wordml/cex" xmlns:w16cid="http://schemas.microsoft.com/office/word/2016/wordml/cid" xmlns:w16="http://schemas.microsoft.com/office/word/2018/wordml" xmlns:w16du="http://schemas.microsoft.com/office/word/2023/wordml/word16du" xmlns:w16sdtdh="http://schemas.microsoft.com/office/word/2020/wordml/sdtdatahash" xmlns:w16sdtfl="http://schemas.microsoft.com/office/word/2024/wordml/sdtformatlock" xmlns:w16se="http://schemas.microsoft.com/office/word/2015/wordml/symex" xmlns:wpg="http://schemas.microsoft.com/office/word/2010/wordprocessingGroup" xmlns:wpi="http://schemas.microsoft.com/office/word/2010/wordprocessingInk" xmlns:wne="http://schemas.microsoft.com/office/word/2006/wordml" xmlns:wps="http://schemas.microsoft.com/office/word/2010/wordprocessingShape" mc:Ignorable="w14 w15 w16se w16cid w16 w16cex w16sdtdh w16sdtfl w16du wp14">
   <w:body>
+    <w:p>
+      <w:pPr>
+        <w:spacing w:after="120"/>
+        <w:jc w:val="both"/>
+        <w:rPr>
+          <w:rFonts w:asciiTheme="majorBidi" w:hAnsiTheme="majorBidi" w:cstheme="majorBidi"/>
+          <w:sz w:val="28"/>
+          <w:szCs w:val="28"/>
+        </w:rPr>
+      </w:pPr>
+      <w:r>
+        <w:rPr>
+          <w:rFonts w:asciiTheme="majorBidi" w:hAnsiTheme="majorBidi" w:cstheme="majorBidi"/>
+          <w:sz w:val="28"/>
+          <w:szCs w:val="28"/>
+        </w:rPr>
+        <w:t xml:space="preserve">  </w:t>
+      </w:r>
+      <w:proofErr w:type="spellStart"/>
+      <w:r>
+        <w:rPr>
+          <w:rFonts w:asciiTheme="majorBidi" w:hAnsiTheme="majorBidi" w:cstheme="majorBidi"/>
+          <w:sz w:val="28"/>
+          <w:szCs w:val="28"/>
+        </w:rPr>
+        <w:t>ResourceQuota</w:t>
+      </w:r>
+      <w:proofErr w:type="spellEnd"/>
+      <w:r>
+        <w:rPr>
+          <w:rFonts w:asciiTheme="majorBidi" w:hAnsiTheme="majorBidi" w:cstheme="majorBidi"/>
+          <w:sz w:val="28"/>
+          <w:szCs w:val="28"/>
+        </w:rPr>
+        <w:t xml:space="preserve"> → Resource management </w:t>
+      </w:r>
+    </w:p>
+    <w:p>
+      <w:pPr>
+        <w:spacing w:after="120"/>
+        <w:jc w:val="both"/>
+        <w:rPr>
+          <w:rFonts w:asciiTheme="majorBidi" w:hAnsiTheme="majorBidi" w:cstheme="majorBidi"/>
+          <w:sz w:val="28"/>
+          <w:szCs w:val="28"/>
+        </w:rPr>
+      </w:pPr>
+      <w:r>
+        <w:rPr>
+          <w:rFonts w:asciiTheme="majorBidi" w:hAnsiTheme="majorBidi" w:cstheme="majorBidi"/>
+          <w:sz w:val="28"/>
+          <w:szCs w:val="28"/>
+        </w:rPr>
+        <w:t xml:space="preserve">  </w:t>
+      </w:r>
+      <w:proofErr w:type="spellStart"/>
+      <w:r>
+        <w:rPr>
+          <w:rFonts w:asciiTheme="majorBidi" w:hAnsiTheme="majorBidi" w:cstheme="majorBidi"/>
+          <w:sz w:val="28"/>
+          <w:szCs w:val="28"/>
+        </w:rPr>
+        <w:t>NetworkPolicy</w:t>
+      </w:r>
+      <w:proofErr w:type="spellEnd"/>
+      <w:r>
+        <w:rPr>
+          <w:rFonts w:asciiTheme="majorBidi" w:hAnsiTheme="majorBidi" w:cstheme="majorBidi"/>
+          <w:sz w:val="28"/>
+          <w:szCs w:val="28"/>
+        </w:rPr>
+        <w:t xml:space="preserve"> → Networking </w:t>
+      </w:r>
+    </w:p>
+    <w:p>
+      <w:pPr>
+        <w:spacing w:after="120"/>
+        <w:jc w:val="both"/>
+        <w:rPr>
+          <w:rFonts w:asciiTheme="majorBidi" w:hAnsiTheme="majorBidi" w:cstheme="majorBidi"/>
+          <w:sz w:val="28"/>
+          <w:szCs w:val="28"/>
+        </w:rPr>
+      </w:pPr>
+      <w:r>
+        <w:rPr>
+          <w:rFonts w:asciiTheme="majorBidi" w:hAnsiTheme="majorBidi" w:cstheme="majorBidi"/>
+          <w:sz w:val="28"/>
+          <w:szCs w:val="28"/>
+        </w:rPr>
+        <w:t xml:space="preserve">  </w:t>
+      </w:r>
+      <w:proofErr w:type="spellStart"/>
+      <w:r>
+        <w:rPr>
+          <w:rFonts w:asciiTheme="majorBidi" w:hAnsiTheme="majorBidi" w:cstheme="majorBidi"/>
+          <w:sz w:val="28"/>
+          <w:szCs w:val="28"/>
+        </w:rPr>
+        <w:t>PodDisruptionBudget</w:t>
+      </w:r>
+      <w:proofErr w:type="spellEnd"/>
+      <w:r>
+        <w:rPr>
+          <w:rFonts w:asciiTheme="majorBidi" w:hAnsiTheme="majorBidi" w:cstheme="majorBidi"/>
+          <w:sz w:val="28"/>
+          <w:szCs w:val="28"/>
+        </w:rPr>
+        <w:t xml:space="preserve"> → Availability/disruptions</w:t>
+      </w:r>
+    </w:p>
+    <w:p>
+      <w:pPr>
+        <w:spacing w:after="120"/>
+        <w:jc w:val="both"/>
+        <w:rPr>
+          <w:rFonts w:asciiTheme="majorBidi" w:hAnsiTheme="majorBidi" w:cstheme="majorBidi"/>
+          <w:sz w:val="28"/>
+          <w:szCs w:val="28"/>
+        </w:rPr>
+      </w:pPr>
+    </w:p>
+    <w:p>
+      <w:pPr>
+        <w:spacing w:after="120"/>
+        <w:jc w:val="both"/>
+        <w:rPr>
+          <w:rFonts w:asciiTheme="majorBidi" w:hAnsiTheme="majorBidi" w:cstheme="majorBidi"/>
+          <w:sz w:val="28"/>
+          <w:szCs w:val="28"/>
+        </w:rPr>
+      </w:pPr>
+    </w:p>
     <w:p>
       <w:pPr>
         <w:spacing w:after="120"/>
@@ -798,6 +931,7 @@
           <w:sz w:val="28"/>
           <w:szCs w:val="28"/>
         </w:rPr>
+        <w:lastRenderedPageBreak/>
         <w:t>eBPF</w:t>
       </w:r>
       <w:proofErr w:type="spellEnd"/>
@@ -983,7 +1117,6 @@
           <w:sz w:val="28"/>
           <w:szCs w:val="28"/>
         </w:rPr>
-        <w:lastRenderedPageBreak/>
         <w:t>ephemeral Pods</w:t>
       </w:r>
     </w:p>
@@ -1066,23 +1199,13 @@
           <w:szCs w:val="28"/>
         </w:rPr>
       </w:pPr>
-      <w:proofErr w:type="gramStart"/>
-      <w:r>
-        <w:rPr>
-          <w:rFonts w:asciiTheme="majorBidi" w:hAnsiTheme="majorBidi" w:cstheme="majorBidi"/>
-          <w:sz w:val="28"/>
-          <w:szCs w:val="28"/>
-        </w:rPr>
-        <w:t>So</w:t>
-      </w:r>
-      <w:proofErr w:type="gramEnd"/>
-      <w:r>
-        <w:rPr>
-          <w:rFonts w:asciiTheme="majorBidi" w:hAnsiTheme="majorBidi" w:cstheme="majorBidi"/>
-          <w:sz w:val="28"/>
-          <w:szCs w:val="28"/>
-        </w:rPr>
-        <w:t xml:space="preserve"> Kubernetes networking is designed to be stable even when the environment is highly unstable.</w:t>
+      <w:r>
+        <w:rPr>
+          <w:rFonts w:asciiTheme="majorBidi" w:hAnsiTheme="majorBidi" w:cstheme="majorBidi"/>
+          <w:sz w:val="28"/>
+          <w:szCs w:val="28"/>
+        </w:rPr>
+        <w:t>So Kubernetes networking is designed to be stable even when the environment is highly unstable.</w:t>
       </w:r>
       <w:r>
         <w:rPr>
@@ -1416,7 +1539,6 @@
           <w:sz w:val="40"/>
           <w:szCs w:val="40"/>
         </w:rPr>
-        <w:lastRenderedPageBreak/>
         <w:t>CNI – Container Network Interface</w:t>
       </w:r>
     </w:p>
@@ -2162,6 +2284,7 @@
           <w:sz w:val="32"/>
           <w:szCs w:val="32"/>
         </w:rPr>
+        <w:lastRenderedPageBreak/>
         <w:t>CNI Plugin Architecture (the mental model)</w:t>
       </w:r>
       <w:r>
@@ -2442,7 +2565,6 @@
           <w:sz w:val="28"/>
           <w:szCs w:val="28"/>
         </w:rPr>
-        <w:lastRenderedPageBreak/>
         <w:t>/opt/</w:t>
       </w:r>
       <w:proofErr w:type="spellStart"/>
@@ -3008,33 +3130,7 @@
                                 <w:sz w:val="28"/>
                                 <w:szCs w:val="28"/>
                               </w:rPr>
-                              <w:t xml:space="preserve">  "</w:t>
-                            </w:r>
-                            <w:proofErr w:type="spellStart"/>
-                            <w:r>
-                              <w:rPr>
-                                <w:rFonts w:asciiTheme="majorBidi" w:hAnsiTheme="majorBidi" w:cstheme="majorBidi"/>
-                                <w:b/>
-                                <w:bCs/>
-                                <w:i/>
-                                <w:iCs/>
-                                <w:sz w:val="28"/>
-                                <w:szCs w:val="28"/>
-                              </w:rPr>
-                              <w:t>cniVersion</w:t>
-                            </w:r>
-                            <w:proofErr w:type="spellEnd"/>
-                            <w:r>
-                              <w:rPr>
-                                <w:rFonts w:asciiTheme="majorBidi" w:hAnsiTheme="majorBidi" w:cstheme="majorBidi"/>
-                                <w:b/>
-                                <w:bCs/>
-                                <w:i/>
-                                <w:iCs/>
-                                <w:sz w:val="28"/>
-                                <w:szCs w:val="28"/>
-                              </w:rPr>
-                              <w:t>": "0.3.1",</w:t>
+                              <w:t xml:space="preserve">  "cniVersion": "0.3.1",</w:t>
                             </w:r>
                           </w:p>
                           <w:p>
@@ -3112,33 +3208,7 @@
                                 <w:sz w:val="28"/>
                                 <w:szCs w:val="28"/>
                               </w:rPr>
-                              <w:t xml:space="preserve">  "</w:t>
-                            </w:r>
-                            <w:proofErr w:type="spellStart"/>
-                            <w:r>
-                              <w:rPr>
-                                <w:rFonts w:asciiTheme="majorBidi" w:hAnsiTheme="majorBidi" w:cstheme="majorBidi"/>
-                                <w:b/>
-                                <w:bCs/>
-                                <w:i/>
-                                <w:iCs/>
-                                <w:sz w:val="28"/>
-                                <w:szCs w:val="28"/>
-                              </w:rPr>
-                              <w:t>ipam</w:t>
-                            </w:r>
-                            <w:proofErr w:type="spellEnd"/>
-                            <w:r>
-                              <w:rPr>
-                                <w:rFonts w:asciiTheme="majorBidi" w:hAnsiTheme="majorBidi" w:cstheme="majorBidi"/>
-                                <w:b/>
-                                <w:bCs/>
-                                <w:i/>
-                                <w:iCs/>
-                                <w:sz w:val="28"/>
-                                <w:szCs w:val="28"/>
-                              </w:rPr>
-                              <w:t>": {...}</w:t>
+                              <w:t xml:space="preserve">  "ipam": {...}</w:t>
                             </w:r>
                           </w:p>
                           <w:p>
@@ -3575,9 +3645,16 @@
           <w:sz w:val="28"/>
           <w:szCs w:val="28"/>
         </w:rPr>
-        <w:t>veth</w:t>
-      </w:r>
-      <w:proofErr w:type="gramStart"/>
+        <w:t>veth0</w:t>
+      </w:r>
+      <w:r>
+        <w:rPr>
+          <w:rFonts w:asciiTheme="majorBidi" w:hAnsiTheme="majorBidi" w:cstheme="majorBidi"/>
+          <w:sz w:val="28"/>
+          <w:szCs w:val="28"/>
+        </w:rPr>
+        <w:t xml:space="preserve">  ←→  </w:t>
+      </w:r>
       <w:r>
         <w:rPr>
           <w:rFonts w:asciiTheme="majorBidi" w:hAnsiTheme="majorBidi" w:cstheme="majorBidi"/>
@@ -3588,40 +3665,7 @@
           <w:sz w:val="28"/>
           <w:szCs w:val="28"/>
         </w:rPr>
-        <w:t>0</w:t>
-      </w:r>
-      <w:r>
-        <w:rPr>
-          <w:rFonts w:asciiTheme="majorBidi" w:hAnsiTheme="majorBidi" w:cstheme="majorBidi"/>
-          <w:sz w:val="28"/>
-          <w:szCs w:val="28"/>
-        </w:rPr>
-        <w:t xml:space="preserve">  ←→  </w:t>
-      </w:r>
-      <w:r>
-        <w:rPr>
-          <w:rFonts w:asciiTheme="majorBidi" w:hAnsiTheme="majorBidi" w:cstheme="majorBidi"/>
-          <w:b/>
-          <w:bCs/>
-          <w:i/>
-          <w:iCs/>
-          <w:sz w:val="28"/>
-          <w:szCs w:val="28"/>
-        </w:rPr>
-        <w:t>veth</w:t>
-      </w:r>
-      <w:proofErr w:type="gramEnd"/>
-      <w:r>
-        <w:rPr>
-          <w:rFonts w:asciiTheme="majorBidi" w:hAnsiTheme="majorBidi" w:cstheme="majorBidi"/>
-          <w:b/>
-          <w:bCs/>
-          <w:i/>
-          <w:iCs/>
-          <w:sz w:val="28"/>
-          <w:szCs w:val="28"/>
-        </w:rPr>
-        <w:t>1</w:t>
+        <w:t>veth1</w:t>
       </w:r>
     </w:p>
     <w:p>
@@ -3864,6 +3908,7 @@
           <w:sz w:val="28"/>
           <w:szCs w:val="28"/>
         </w:rPr>
+        <w:lastRenderedPageBreak/>
         <w:t>dual-stack IPv4+IPv6</w:t>
       </w:r>
     </w:p>
@@ -4052,7 +4097,6 @@
           <w:sz w:val="28"/>
           <w:szCs w:val="28"/>
         </w:rPr>
-        <w:lastRenderedPageBreak/>
         <w:t xml:space="preserve">Step 6 </w:t>
       </w:r>
       <w:r>
@@ -4766,6 +4810,7 @@
           <w:sz w:val="28"/>
           <w:szCs w:val="28"/>
         </w:rPr>
+        <w:lastRenderedPageBreak/>
         <w:t>Native performance</w:t>
       </w:r>
     </w:p>
@@ -4929,7 +4974,6 @@
           <w:sz w:val="28"/>
           <w:szCs w:val="28"/>
         </w:rPr>
-        <w:lastRenderedPageBreak/>
         <w:t>Operations:</w:t>
       </w:r>
     </w:p>
@@ -5558,23 +5602,13 @@
                               </w:rPr>
                               <w:t xml:space="preserve">Pod A eth0 → </w:t>
                             </w:r>
-                            <w:proofErr w:type="spellStart"/>
                             <w:r>
                               <w:rPr>
                                 <w:rFonts w:asciiTheme="majorBidi" w:hAnsiTheme="majorBidi" w:cstheme="majorBidi"/>
                                 <w:sz w:val="28"/>
                                 <w:szCs w:val="28"/>
                               </w:rPr>
-                              <w:t>veth</w:t>
-                            </w:r>
-                            <w:proofErr w:type="spellEnd"/>
-                            <w:r>
-                              <w:rPr>
-                                <w:rFonts w:asciiTheme="majorBidi" w:hAnsiTheme="majorBidi" w:cstheme="majorBidi"/>
-                                <w:sz w:val="28"/>
-                                <w:szCs w:val="28"/>
-                              </w:rPr>
-                              <w:t xml:space="preserve"> → CNI → node A host network</w:t>
+                              <w:t>veth → CNI → node A host network</w:t>
                             </w:r>
                           </w:p>
                           <w:p>
@@ -5646,25 +5680,7 @@
                                 <w:sz w:val="28"/>
                                 <w:szCs w:val="28"/>
                               </w:rPr>
-                              <w:t xml:space="preserve">       node B host network → </w:t>
-                            </w:r>
-                            <w:proofErr w:type="spellStart"/>
-                            <w:r>
-                              <w:rPr>
-                                <w:rFonts w:asciiTheme="majorBidi" w:hAnsiTheme="majorBidi" w:cstheme="majorBidi"/>
-                                <w:sz w:val="28"/>
-                                <w:szCs w:val="28"/>
-                              </w:rPr>
-                              <w:t>veth</w:t>
-                            </w:r>
-                            <w:proofErr w:type="spellEnd"/>
-                            <w:r>
-                              <w:rPr>
-                                <w:rFonts w:asciiTheme="majorBidi" w:hAnsiTheme="majorBidi" w:cstheme="majorBidi"/>
-                                <w:sz w:val="28"/>
-                                <w:szCs w:val="28"/>
-                              </w:rPr>
-                              <w:t xml:space="preserve"> → Pod B eth0</w:t>
+                              <w:t xml:space="preserve">       node B host network → veth → Pod B eth0</w:t>
                             </w:r>
                           </w:p>
                           <w:p>
@@ -6027,7 +6043,6 @@
           <w:sz w:val="28"/>
           <w:szCs w:val="28"/>
         </w:rPr>
-        <w:lastRenderedPageBreak/>
         <w:t>cloud-provider VPC routing</w:t>
       </w:r>
     </w:p>
@@ -6507,7 +6522,6 @@
           <w:sz w:val="40"/>
           <w:szCs w:val="40"/>
         </w:rPr>
-        <w:lastRenderedPageBreak/>
         <w:t>Network Policy:</w:t>
       </w:r>
     </w:p>
@@ -7135,6 +7149,7 @@
           <w:sz w:val="28"/>
           <w:szCs w:val="28"/>
         </w:rPr>
+        <w:lastRenderedPageBreak/>
         <w:t>Only traffic explicitly allowed is permitted.</w:t>
       </w:r>
     </w:p>
@@ -7246,7 +7261,6 @@
                                 <w:szCs w:val="28"/>
                               </w:rPr>
                             </w:pPr>
-                            <w:proofErr w:type="spellStart"/>
                             <w:r>
                               <w:rPr>
                                 <w:rFonts w:asciiTheme="majorBidi" w:hAnsiTheme="majorBidi" w:cstheme="majorBidi"/>
@@ -7257,20 +7271,7 @@
                                 <w:sz w:val="28"/>
                                 <w:szCs w:val="28"/>
                               </w:rPr>
-                              <w:t>apiVersion</w:t>
-                            </w:r>
-                            <w:proofErr w:type="spellEnd"/>
-                            <w:r>
-                              <w:rPr>
-                                <w:rFonts w:asciiTheme="majorBidi" w:hAnsiTheme="majorBidi" w:cstheme="majorBidi"/>
-                                <w:b/>
-                                <w:bCs/>
-                                <w:i/>
-                                <w:iCs/>
-                                <w:sz w:val="28"/>
-                                <w:szCs w:val="28"/>
-                              </w:rPr>
-                              <w:t>: networking.k8s.io/v1</w:t>
+                              <w:t>apiVersion: networking.k8s.io/v1</w:t>
                             </w:r>
                           </w:p>
                           <w:p>
@@ -7296,22 +7297,8 @@
                                 <w:sz w:val="28"/>
                                 <w:szCs w:val="28"/>
                               </w:rPr>
-                              <w:t xml:space="preserve">kind: </w:t>
+                              <w:t>kind: NetworkPolicy</w:t>
                             </w:r>
-                            <w:proofErr w:type="spellStart"/>
-                            <w:r>
-                              <w:rPr>
-                                <w:rFonts w:asciiTheme="majorBidi" w:hAnsiTheme="majorBidi" w:cstheme="majorBidi"/>
-                                <w:b/>
-                                <w:bCs/>
-                                <w:i/>
-                                <w:iCs/>
-                                <w:sz w:val="28"/>
-                                <w:szCs w:val="28"/>
-                              </w:rPr>
-                              <w:t>NetworkPolicy</w:t>
-                            </w:r>
-                            <w:proofErr w:type="spellEnd"/>
                           </w:p>
                           <w:p>
                             <w:pPr>
@@ -7626,7 +7613,6 @@
         <w:rPr>
           <w:noProof/>
         </w:rPr>
-        <w:lastRenderedPageBreak/>
         <mc:AlternateContent>
           <mc:Choice Requires="wps">
             <w:drawing>
@@ -7725,7 +7711,6 @@
                               </w:rPr>
                               <w:t xml:space="preserve">     </w:t>
                             </w:r>
-                            <w:proofErr w:type="spellStart"/>
                             <w:r>
                               <w:rPr>
                                 <w:rFonts w:asciiTheme="majorBidi" w:hAnsiTheme="majorBidi" w:cstheme="majorBidi"/>
@@ -7736,20 +7721,7 @@
                                 <w:sz w:val="28"/>
                                 <w:szCs w:val="28"/>
                               </w:rPr>
-                              <w:t>podSelector</w:t>
-                            </w:r>
-                            <w:proofErr w:type="spellEnd"/>
-                            <w:r>
-                              <w:rPr>
-                                <w:rFonts w:asciiTheme="majorBidi" w:hAnsiTheme="majorBidi" w:cstheme="majorBidi"/>
-                                <w:b/>
-                                <w:bCs/>
-                                <w:i/>
-                                <w:iCs/>
-                                <w:sz w:val="28"/>
-                                <w:szCs w:val="28"/>
-                              </w:rPr>
-                              <w:t>:</w:t>
+                              <w:t>podSelector:</w:t>
                             </w:r>
                           </w:p>
                           <w:p>
@@ -7789,7 +7761,6 @@
                               </w:rPr>
                               <w:t xml:space="preserve">     </w:t>
                             </w:r>
-                            <w:proofErr w:type="spellStart"/>
                             <w:r>
                               <w:rPr>
                                 <w:rFonts w:asciiTheme="majorBidi" w:hAnsiTheme="majorBidi" w:cstheme="majorBidi"/>
@@ -7800,20 +7771,7 @@
                                 <w:sz w:val="28"/>
                                 <w:szCs w:val="28"/>
                               </w:rPr>
-                              <w:t>matchLabels</w:t>
-                            </w:r>
-                            <w:proofErr w:type="spellEnd"/>
-                            <w:r>
-                              <w:rPr>
-                                <w:rFonts w:asciiTheme="majorBidi" w:hAnsiTheme="majorBidi" w:cstheme="majorBidi"/>
-                                <w:b/>
-                                <w:bCs/>
-                                <w:i/>
-                                <w:iCs/>
-                                <w:sz w:val="28"/>
-                                <w:szCs w:val="28"/>
-                              </w:rPr>
-                              <w:t>:</w:t>
+                              <w:t>matchLabels:</w:t>
                             </w:r>
                           </w:p>
                           <w:p>
@@ -7891,7 +7849,6 @@
                               </w:rPr>
                               <w:t xml:space="preserve">     </w:t>
                             </w:r>
-                            <w:proofErr w:type="spellStart"/>
                             <w:r>
                               <w:rPr>
                                 <w:rFonts w:asciiTheme="majorBidi" w:hAnsiTheme="majorBidi" w:cstheme="majorBidi"/>
@@ -7902,20 +7859,7 @@
                                 <w:sz w:val="28"/>
                                 <w:szCs w:val="28"/>
                               </w:rPr>
-                              <w:t>policyTypes</w:t>
-                            </w:r>
-                            <w:proofErr w:type="spellEnd"/>
-                            <w:r>
-                              <w:rPr>
-                                <w:rFonts w:asciiTheme="majorBidi" w:hAnsiTheme="majorBidi" w:cstheme="majorBidi"/>
-                                <w:b/>
-                                <w:bCs/>
-                                <w:i/>
-                                <w:iCs/>
-                                <w:sz w:val="28"/>
-                                <w:szCs w:val="28"/>
-                              </w:rPr>
-                              <w:t>:</w:t>
+                              <w:t>policyTypes:</w:t>
                             </w:r>
                           </w:p>
                           <w:p>
@@ -8067,33 +8011,7 @@
                                 <w:sz w:val="28"/>
                                 <w:szCs w:val="28"/>
                               </w:rPr>
-                              <w:t xml:space="preserve">- </w:t>
-                            </w:r>
-                            <w:proofErr w:type="spellStart"/>
-                            <w:r>
-                              <w:rPr>
-                                <w:rFonts w:asciiTheme="majorBidi" w:hAnsiTheme="majorBidi" w:cstheme="majorBidi"/>
-                                <w:b/>
-                                <w:bCs/>
-                                <w:i/>
-                                <w:iCs/>
-                                <w:sz w:val="28"/>
-                                <w:szCs w:val="28"/>
-                              </w:rPr>
-                              <w:t>podSelector</w:t>
-                            </w:r>
-                            <w:proofErr w:type="spellEnd"/>
-                            <w:r>
-                              <w:rPr>
-                                <w:rFonts w:asciiTheme="majorBidi" w:hAnsiTheme="majorBidi" w:cstheme="majorBidi"/>
-                                <w:b/>
-                                <w:bCs/>
-                                <w:i/>
-                                <w:iCs/>
-                                <w:sz w:val="28"/>
-                                <w:szCs w:val="28"/>
-                              </w:rPr>
-                              <w:t>:</w:t>
+                              <w:t>- podSelector:</w:t>
                             </w:r>
                           </w:p>
                           <w:p>
@@ -8121,7 +8039,6 @@
                               </w:rPr>
                               <w:t xml:space="preserve">                    </w:t>
                             </w:r>
-                            <w:proofErr w:type="spellStart"/>
                             <w:r>
                               <w:rPr>
                                 <w:rFonts w:asciiTheme="majorBidi" w:hAnsiTheme="majorBidi" w:cstheme="majorBidi"/>
@@ -8132,20 +8049,7 @@
                                 <w:sz w:val="28"/>
                                 <w:szCs w:val="28"/>
                               </w:rPr>
-                              <w:t>matchLabels</w:t>
-                            </w:r>
-                            <w:proofErr w:type="spellEnd"/>
-                            <w:r>
-                              <w:rPr>
-                                <w:rFonts w:asciiTheme="majorBidi" w:hAnsiTheme="majorBidi" w:cstheme="majorBidi"/>
-                                <w:b/>
-                                <w:bCs/>
-                                <w:i/>
-                                <w:iCs/>
-                                <w:sz w:val="28"/>
-                                <w:szCs w:val="28"/>
-                              </w:rPr>
-                              <w:t>:</w:t>
+                              <w:t>matchLabels:</w:t>
                             </w:r>
                           </w:p>
                           <w:p>
@@ -9022,7 +8926,6 @@
                               </w:rPr>
                               <w:t xml:space="preserve">  </w:t>
                             </w:r>
-                            <w:proofErr w:type="spellStart"/>
                             <w:r>
                               <w:rPr>
                                 <w:rFonts w:asciiTheme="majorBidi" w:hAnsiTheme="majorBidi" w:cstheme="majorBidi"/>
@@ -9035,7 +8938,6 @@
                               </w:rPr>
                               <w:t>podSelector</w:t>
                             </w:r>
-                            <w:proofErr w:type="spellEnd"/>
                           </w:p>
                           <w:p>
                             <w:pPr>
@@ -9060,22 +8962,8 @@
                                 <w:sz w:val="28"/>
                                 <w:szCs w:val="28"/>
                               </w:rPr>
-                              <w:t xml:space="preserve">  </w:t>
+                              <w:t xml:space="preserve">  policyTypes</w:t>
                             </w:r>
-                            <w:proofErr w:type="spellStart"/>
-                            <w:r>
-                              <w:rPr>
-                                <w:rFonts w:asciiTheme="majorBidi" w:hAnsiTheme="majorBidi" w:cstheme="majorBidi"/>
-                                <w:b/>
-                                <w:bCs/>
-                                <w:i/>
-                                <w:iCs/>
-                                <w:sz w:val="28"/>
-                                <w:szCs w:val="28"/>
-                              </w:rPr>
-                              <w:t>policyTypes</w:t>
-                            </w:r>
-                            <w:proofErr w:type="spellEnd"/>
                           </w:p>
                           <w:p>
                             <w:pPr>
@@ -9576,6 +9464,7 @@
           <w:sz w:val="28"/>
           <w:szCs w:val="28"/>
         </w:rPr>
+        <w:lastRenderedPageBreak/>
         <w:t>Egress</w:t>
       </w:r>
     </w:p>
@@ -9802,7 +9691,6 @@
           <w:sz w:val="28"/>
           <w:szCs w:val="28"/>
         </w:rPr>
-        <w:lastRenderedPageBreak/>
         <w:t>ports</w:t>
       </w:r>
     </w:p>
@@ -9972,7 +9860,6 @@
                               </w:rPr>
                               <w:t xml:space="preserve">- </w:t>
                             </w:r>
-                            <w:proofErr w:type="spellStart"/>
                             <w:r>
                               <w:rPr>
                                 <w:rFonts w:asciiTheme="majorBidi" w:hAnsiTheme="majorBidi" w:cstheme="majorBidi"/>
@@ -9983,20 +9870,7 @@
                                 <w:sz w:val="28"/>
                                 <w:szCs w:val="28"/>
                               </w:rPr>
-                              <w:t>podSelector</w:t>
-                            </w:r>
-                            <w:proofErr w:type="spellEnd"/>
-                            <w:r>
-                              <w:rPr>
-                                <w:rFonts w:asciiTheme="majorBidi" w:hAnsiTheme="majorBidi" w:cstheme="majorBidi"/>
-                                <w:b/>
-                                <w:bCs/>
-                                <w:i/>
-                                <w:iCs/>
-                                <w:sz w:val="28"/>
-                                <w:szCs w:val="28"/>
-                              </w:rPr>
-                              <w:t>:</w:t>
+                              <w:t>podSelector:</w:t>
                             </w:r>
                           </w:p>
                           <w:p>
@@ -10024,7 +9898,6 @@
                               </w:rPr>
                               <w:t xml:space="preserve">               </w:t>
                             </w:r>
-                            <w:proofErr w:type="spellStart"/>
                             <w:r>
                               <w:rPr>
                                 <w:rFonts w:asciiTheme="majorBidi" w:hAnsiTheme="majorBidi" w:cstheme="majorBidi"/>
@@ -10035,20 +9908,7 @@
                                 <w:sz w:val="28"/>
                                 <w:szCs w:val="28"/>
                               </w:rPr>
-                              <w:t>matchLabels</w:t>
-                            </w:r>
-                            <w:proofErr w:type="spellEnd"/>
-                            <w:r>
-                              <w:rPr>
-                                <w:rFonts w:asciiTheme="majorBidi" w:hAnsiTheme="majorBidi" w:cstheme="majorBidi"/>
-                                <w:b/>
-                                <w:bCs/>
-                                <w:i/>
-                                <w:iCs/>
-                                <w:sz w:val="28"/>
-                                <w:szCs w:val="28"/>
-                              </w:rPr>
-                              <w:t>:</w:t>
+                              <w:t>matchLabels:</w:t>
                             </w:r>
                           </w:p>
                           <w:p>
@@ -10086,22 +9946,8 @@
                                 <w:sz w:val="28"/>
                                 <w:szCs w:val="28"/>
                               </w:rPr>
-                              <w:t xml:space="preserve">app: </w:t>
+                              <w:t>app: api</w:t>
                             </w:r>
-                            <w:proofErr w:type="spellStart"/>
-                            <w:r>
-                              <w:rPr>
-                                <w:rFonts w:asciiTheme="majorBidi" w:hAnsiTheme="majorBidi" w:cstheme="majorBidi"/>
-                                <w:b/>
-                                <w:bCs/>
-                                <w:i/>
-                                <w:iCs/>
-                                <w:sz w:val="28"/>
-                                <w:szCs w:val="28"/>
-                              </w:rPr>
-                              <w:t>api</w:t>
-                            </w:r>
-                            <w:proofErr w:type="spellEnd"/>
                           </w:p>
                           <w:p>
                             <w:pPr>
@@ -10976,7 +10822,6 @@
                               </w:rPr>
                               <w:t xml:space="preserve">- </w:t>
                             </w:r>
-                            <w:proofErr w:type="spellStart"/>
                             <w:r>
                               <w:rPr>
                                 <w:rFonts w:asciiTheme="majorBidi" w:hAnsiTheme="majorBidi" w:cstheme="majorBidi"/>
@@ -10987,20 +10832,7 @@
                                 <w:sz w:val="28"/>
                                 <w:szCs w:val="28"/>
                               </w:rPr>
-                              <w:t>ipBlock</w:t>
-                            </w:r>
-                            <w:proofErr w:type="spellEnd"/>
-                            <w:r>
-                              <w:rPr>
-                                <w:rFonts w:asciiTheme="majorBidi" w:hAnsiTheme="majorBidi" w:cstheme="majorBidi"/>
-                                <w:b/>
-                                <w:bCs/>
-                                <w:i/>
-                                <w:iCs/>
-                                <w:sz w:val="28"/>
-                                <w:szCs w:val="28"/>
-                              </w:rPr>
-                              <w:t>:</w:t>
+                              <w:t>ipBlock:</w:t>
                             </w:r>
                           </w:p>
                           <w:p>
@@ -11028,7 +10860,6 @@
                               </w:rPr>
                               <w:t xml:space="preserve">               </w:t>
                             </w:r>
-                            <w:proofErr w:type="spellStart"/>
                             <w:r>
                               <w:rPr>
                                 <w:rFonts w:asciiTheme="majorBidi" w:hAnsiTheme="majorBidi" w:cstheme="majorBidi"/>
@@ -11039,20 +10870,7 @@
                                 <w:sz w:val="28"/>
                                 <w:szCs w:val="28"/>
                               </w:rPr>
-                              <w:t>cidr</w:t>
-                            </w:r>
-                            <w:proofErr w:type="spellEnd"/>
-                            <w:r>
-                              <w:rPr>
-                                <w:rFonts w:asciiTheme="majorBidi" w:hAnsiTheme="majorBidi" w:cstheme="majorBidi"/>
-                                <w:b/>
-                                <w:bCs/>
-                                <w:i/>
-                                <w:iCs/>
-                                <w:sz w:val="28"/>
-                                <w:szCs w:val="28"/>
-                              </w:rPr>
-                              <w:t>: 10.0.0.0/8</w:t>
+                              <w:t>cidr: 10.0.0.0/8</w:t>
                             </w:r>
                           </w:p>
                           <w:p>
@@ -11542,6 +11360,7 @@
           <w:sz w:val="32"/>
           <w:szCs w:val="32"/>
         </w:rPr>
+        <w:lastRenderedPageBreak/>
         <w:t>namespaceSelector</w:t>
       </w:r>
       <w:proofErr w:type="spellEnd"/>
@@ -11635,7 +11454,6 @@
                                 <w:szCs w:val="28"/>
                               </w:rPr>
                             </w:pPr>
-                            <w:proofErr w:type="spellStart"/>
                             <w:r>
                               <w:rPr>
                                 <w:rFonts w:asciiTheme="majorBidi" w:hAnsiTheme="majorBidi" w:cstheme="majorBidi"/>
@@ -11646,20 +11464,7 @@
                                 <w:sz w:val="28"/>
                                 <w:szCs w:val="28"/>
                               </w:rPr>
-                              <w:t>namespaceSelector</w:t>
-                            </w:r>
-                            <w:proofErr w:type="spellEnd"/>
-                            <w:r>
-                              <w:rPr>
-                                <w:rFonts w:asciiTheme="majorBidi" w:hAnsiTheme="majorBidi" w:cstheme="majorBidi"/>
-                                <w:b/>
-                                <w:bCs/>
-                                <w:i/>
-                                <w:iCs/>
-                                <w:sz w:val="28"/>
-                                <w:szCs w:val="28"/>
-                              </w:rPr>
-                              <w:t>:</w:t>
+                              <w:t>namespaceSelector:</w:t>
                             </w:r>
                           </w:p>
                           <w:p>
@@ -11687,7 +11492,6 @@
                               </w:rPr>
                               <w:t xml:space="preserve">     </w:t>
                             </w:r>
-                            <w:proofErr w:type="spellStart"/>
                             <w:r>
                               <w:rPr>
                                 <w:rFonts w:asciiTheme="majorBidi" w:hAnsiTheme="majorBidi" w:cstheme="majorBidi"/>
@@ -11698,20 +11502,7 @@
                                 <w:sz w:val="28"/>
                                 <w:szCs w:val="28"/>
                               </w:rPr>
-                              <w:t>matchLabels</w:t>
-                            </w:r>
-                            <w:proofErr w:type="spellEnd"/>
-                            <w:r>
-                              <w:rPr>
-                                <w:rFonts w:asciiTheme="majorBidi" w:hAnsiTheme="majorBidi" w:cstheme="majorBidi"/>
-                                <w:b/>
-                                <w:bCs/>
-                                <w:i/>
-                                <w:iCs/>
-                                <w:sz w:val="28"/>
-                                <w:szCs w:val="28"/>
-                              </w:rPr>
-                              <w:t>:</w:t>
+                              <w:t>matchLabels:</w:t>
                             </w:r>
                           </w:p>
                           <w:p>
@@ -12061,7 +11852,6 @@
           <w:sz w:val="32"/>
           <w:szCs w:val="32"/>
         </w:rPr>
-        <w:lastRenderedPageBreak/>
         <w:t>ipBlock</w:t>
       </w:r>
       <w:proofErr w:type="spellEnd"/>
@@ -12153,7 +11943,6 @@
                                 <w:szCs w:val="28"/>
                               </w:rPr>
                             </w:pPr>
-                            <w:proofErr w:type="spellStart"/>
                             <w:r>
                               <w:rPr>
                                 <w:rFonts w:asciiTheme="majorBidi" w:hAnsiTheme="majorBidi" w:cstheme="majorBidi"/>
@@ -12164,20 +11953,7 @@
                                 <w:sz w:val="28"/>
                                 <w:szCs w:val="28"/>
                               </w:rPr>
-                              <w:t>ipBlock</w:t>
-                            </w:r>
-                            <w:proofErr w:type="spellEnd"/>
-                            <w:r>
-                              <w:rPr>
-                                <w:rFonts w:asciiTheme="majorBidi" w:hAnsiTheme="majorBidi" w:cstheme="majorBidi"/>
-                                <w:b/>
-                                <w:bCs/>
-                                <w:i/>
-                                <w:iCs/>
-                                <w:sz w:val="28"/>
-                                <w:szCs w:val="28"/>
-                              </w:rPr>
-                              <w:t>:</w:t>
+                              <w:t>ipBlock:</w:t>
                             </w:r>
                           </w:p>
                           <w:p>
@@ -12203,33 +11979,7 @@
                                 <w:sz w:val="28"/>
                                 <w:szCs w:val="28"/>
                               </w:rPr>
-                              <w:t xml:space="preserve">     </w:t>
-                            </w:r>
-                            <w:proofErr w:type="spellStart"/>
-                            <w:r>
-                              <w:rPr>
-                                <w:rFonts w:asciiTheme="majorBidi" w:hAnsiTheme="majorBidi" w:cstheme="majorBidi"/>
-                                <w:b/>
-                                <w:bCs/>
-                                <w:i/>
-                                <w:iCs/>
-                                <w:sz w:val="28"/>
-                                <w:szCs w:val="28"/>
-                              </w:rPr>
-                              <w:t>cidr</w:t>
-                            </w:r>
-                            <w:proofErr w:type="spellEnd"/>
-                            <w:r>
-                              <w:rPr>
-                                <w:rFonts w:asciiTheme="majorBidi" w:hAnsiTheme="majorBidi" w:cstheme="majorBidi"/>
-                                <w:b/>
-                                <w:bCs/>
-                                <w:i/>
-                                <w:iCs/>
-                                <w:sz w:val="28"/>
-                                <w:szCs w:val="28"/>
-                              </w:rPr>
-                              <w:t>: 192.168.1.0/24</w:t>
+                              <w:t xml:space="preserve">     cidr: 192.168.1.0/24</w:t>
                             </w:r>
                           </w:p>
                           <w:p>
@@ -12864,7 +12614,6 @@
                               </w:rPr>
                               <w:t xml:space="preserve">- </w:t>
                             </w:r>
-                            <w:proofErr w:type="spellStart"/>
                             <w:r>
                               <w:rPr>
                                 <w:rFonts w:asciiTheme="majorBidi" w:hAnsiTheme="majorBidi" w:cstheme="majorBidi"/>
@@ -12875,20 +12624,7 @@
                                 <w:sz w:val="28"/>
                                 <w:szCs w:val="28"/>
                               </w:rPr>
-                              <w:t>namespaceSelector</w:t>
-                            </w:r>
-                            <w:proofErr w:type="spellEnd"/>
-                            <w:r>
-                              <w:rPr>
-                                <w:rFonts w:asciiTheme="majorBidi" w:hAnsiTheme="majorBidi" w:cstheme="majorBidi"/>
-                                <w:b/>
-                                <w:bCs/>
-                                <w:i/>
-                                <w:iCs/>
-                                <w:sz w:val="28"/>
-                                <w:szCs w:val="28"/>
-                              </w:rPr>
-                              <w:t>:</w:t>
+                              <w:t>namespaceSelector:</w:t>
                             </w:r>
                           </w:p>
                           <w:p>
@@ -12916,7 +12652,6 @@
                               </w:rPr>
                               <w:t xml:space="preserve">          </w:t>
                             </w:r>
-                            <w:proofErr w:type="spellStart"/>
                             <w:r>
                               <w:rPr>
                                 <w:rFonts w:asciiTheme="majorBidi" w:hAnsiTheme="majorBidi" w:cstheme="majorBidi"/>
@@ -12927,20 +12662,7 @@
                                 <w:sz w:val="28"/>
                                 <w:szCs w:val="28"/>
                               </w:rPr>
-                              <w:t>matchLabels</w:t>
-                            </w:r>
-                            <w:proofErr w:type="spellEnd"/>
-                            <w:r>
-                              <w:rPr>
-                                <w:rFonts w:asciiTheme="majorBidi" w:hAnsiTheme="majorBidi" w:cstheme="majorBidi"/>
-                                <w:b/>
-                                <w:bCs/>
-                                <w:i/>
-                                <w:iCs/>
-                                <w:sz w:val="28"/>
-                                <w:szCs w:val="28"/>
-                              </w:rPr>
-                              <w:t>:</w:t>
+                              <w:t>matchLabels:</w:t>
                             </w:r>
                           </w:p>
                           <w:p>
@@ -13018,7 +12740,6 @@
                               </w:rPr>
                               <w:t xml:space="preserve">     </w:t>
                             </w:r>
-                            <w:proofErr w:type="spellStart"/>
                             <w:r>
                               <w:rPr>
                                 <w:rFonts w:asciiTheme="majorBidi" w:hAnsiTheme="majorBidi" w:cstheme="majorBidi"/>
@@ -13029,20 +12750,7 @@
                                 <w:sz w:val="28"/>
                                 <w:szCs w:val="28"/>
                               </w:rPr>
-                              <w:t>podSelector</w:t>
-                            </w:r>
-                            <w:proofErr w:type="spellEnd"/>
-                            <w:r>
-                              <w:rPr>
-                                <w:rFonts w:asciiTheme="majorBidi" w:hAnsiTheme="majorBidi" w:cstheme="majorBidi"/>
-                                <w:b/>
-                                <w:bCs/>
-                                <w:i/>
-                                <w:iCs/>
-                                <w:sz w:val="28"/>
-                                <w:szCs w:val="28"/>
-                              </w:rPr>
-                              <w:t>:</w:t>
+                              <w:t>podSelector:</w:t>
                             </w:r>
                           </w:p>
                           <w:p>
@@ -13070,7 +12778,6 @@
                               </w:rPr>
                               <w:t xml:space="preserve">          </w:t>
                             </w:r>
-                            <w:proofErr w:type="spellStart"/>
                             <w:r>
                               <w:rPr>
                                 <w:rFonts w:asciiTheme="majorBidi" w:hAnsiTheme="majorBidi" w:cstheme="majorBidi"/>
@@ -13081,20 +12788,7 @@
                                 <w:sz w:val="28"/>
                                 <w:szCs w:val="28"/>
                               </w:rPr>
-                              <w:t>matchLabels</w:t>
-                            </w:r>
-                            <w:proofErr w:type="spellEnd"/>
-                            <w:r>
-                              <w:rPr>
-                                <w:rFonts w:asciiTheme="majorBidi" w:hAnsiTheme="majorBidi" w:cstheme="majorBidi"/>
-                                <w:b/>
-                                <w:bCs/>
-                                <w:i/>
-                                <w:iCs/>
-                                <w:sz w:val="28"/>
-                                <w:szCs w:val="28"/>
-                              </w:rPr>
-                              <w:t>:</w:t>
+                              <w:t>matchLabels:</w:t>
                             </w:r>
                           </w:p>
                           <w:p>
@@ -13132,22 +12826,8 @@
                                 <w:sz w:val="28"/>
                                 <w:szCs w:val="28"/>
                               </w:rPr>
-                              <w:t xml:space="preserve">role: </w:t>
+                              <w:t>role: api</w:t>
                             </w:r>
-                            <w:proofErr w:type="spellStart"/>
-                            <w:r>
-                              <w:rPr>
-                                <w:rFonts w:asciiTheme="majorBidi" w:hAnsiTheme="majorBidi" w:cstheme="majorBidi"/>
-                                <w:b/>
-                                <w:bCs/>
-                                <w:i/>
-                                <w:iCs/>
-                                <w:sz w:val="28"/>
-                                <w:szCs w:val="28"/>
-                              </w:rPr>
-                              <w:t>api</w:t>
-                            </w:r>
-                            <w:proofErr w:type="spellEnd"/>
                           </w:p>
                           <w:p>
                             <w:pPr>
@@ -13833,7 +13513,6 @@
                                 <w:szCs w:val="28"/>
                               </w:rPr>
                             </w:pPr>
-                            <w:proofErr w:type="spellStart"/>
                             <w:r>
                               <w:rPr>
                                 <w:rFonts w:asciiTheme="majorBidi" w:hAnsiTheme="majorBidi" w:cstheme="majorBidi"/>
@@ -13844,20 +13523,7 @@
                                 <w:sz w:val="28"/>
                                 <w:szCs w:val="28"/>
                               </w:rPr>
-                              <w:t>podSelector</w:t>
-                            </w:r>
-                            <w:proofErr w:type="spellEnd"/>
-                            <w:r>
-                              <w:rPr>
-                                <w:rFonts w:asciiTheme="majorBidi" w:hAnsiTheme="majorBidi" w:cstheme="majorBidi"/>
-                                <w:b/>
-                                <w:bCs/>
-                                <w:i/>
-                                <w:iCs/>
-                                <w:sz w:val="28"/>
-                                <w:szCs w:val="28"/>
-                              </w:rPr>
-                              <w:t>: {}</w:t>
+                              <w:t>podSelector: {}</w:t>
                             </w:r>
                           </w:p>
                           <w:p>
@@ -13873,7 +13539,6 @@
                                 <w:szCs w:val="28"/>
                               </w:rPr>
                             </w:pPr>
-                            <w:proofErr w:type="spellStart"/>
                             <w:r>
                               <w:rPr>
                                 <w:rFonts w:asciiTheme="majorBidi" w:hAnsiTheme="majorBidi" w:cstheme="majorBidi"/>
@@ -13884,20 +13549,7 @@
                                 <w:sz w:val="28"/>
                                 <w:szCs w:val="28"/>
                               </w:rPr>
-                              <w:t>policyTypes</w:t>
-                            </w:r>
-                            <w:proofErr w:type="spellEnd"/>
-                            <w:r>
-                              <w:rPr>
-                                <w:rFonts w:asciiTheme="majorBidi" w:hAnsiTheme="majorBidi" w:cstheme="majorBidi"/>
-                                <w:b/>
-                                <w:bCs/>
-                                <w:i/>
-                                <w:iCs/>
-                                <w:sz w:val="28"/>
-                                <w:szCs w:val="28"/>
-                              </w:rPr>
-                              <w:t>:</w:t>
+                              <w:t>policyTypes:</w:t>
                             </w:r>
                           </w:p>
                           <w:p>
@@ -14182,6 +13834,7 @@
           <w:szCs w:val="28"/>
           <w:u w:val="single"/>
         </w:rPr>
+        <w:lastRenderedPageBreak/>
         <w:t>Meaning:</w:t>
       </w:r>
     </w:p>
@@ -14316,7 +13969,6 @@
                                 <w:szCs w:val="28"/>
                               </w:rPr>
                             </w:pPr>
-                            <w:proofErr w:type="spellStart"/>
                             <w:r>
                               <w:rPr>
                                 <w:rFonts w:asciiTheme="majorBidi" w:hAnsiTheme="majorBidi" w:cstheme="majorBidi"/>
@@ -14327,20 +13979,7 @@
                                 <w:sz w:val="28"/>
                                 <w:szCs w:val="28"/>
                               </w:rPr>
-                              <w:t>podSelector</w:t>
-                            </w:r>
-                            <w:proofErr w:type="spellEnd"/>
-                            <w:r>
-                              <w:rPr>
-                                <w:rFonts w:asciiTheme="majorBidi" w:hAnsiTheme="majorBidi" w:cstheme="majorBidi"/>
-                                <w:b/>
-                                <w:bCs/>
-                                <w:i/>
-                                <w:iCs/>
-                                <w:sz w:val="28"/>
-                                <w:szCs w:val="28"/>
-                              </w:rPr>
-                              <w:t>: {}</w:t>
+                              <w:t>podSelector: {}</w:t>
                             </w:r>
                           </w:p>
                           <w:p>
@@ -14356,7 +13995,6 @@
                                 <w:szCs w:val="28"/>
                               </w:rPr>
                             </w:pPr>
-                            <w:proofErr w:type="spellStart"/>
                             <w:r>
                               <w:rPr>
                                 <w:rFonts w:asciiTheme="majorBidi" w:hAnsiTheme="majorBidi" w:cstheme="majorBidi"/>
@@ -14367,20 +14005,7 @@
                                 <w:sz w:val="28"/>
                                 <w:szCs w:val="28"/>
                               </w:rPr>
-                              <w:t>policyTypes</w:t>
-                            </w:r>
-                            <w:proofErr w:type="spellEnd"/>
-                            <w:r>
-                              <w:rPr>
-                                <w:rFonts w:asciiTheme="majorBidi" w:hAnsiTheme="majorBidi" w:cstheme="majorBidi"/>
-                                <w:b/>
-                                <w:bCs/>
-                                <w:i/>
-                                <w:iCs/>
-                                <w:sz w:val="28"/>
-                                <w:szCs w:val="28"/>
-                              </w:rPr>
-                              <w:t>:</w:t>
+                              <w:t>policyTypes:</w:t>
                             </w:r>
                           </w:p>
                           <w:p>
@@ -14719,7 +14344,6 @@
           <w:sz w:val="28"/>
           <w:szCs w:val="28"/>
         </w:rPr>
-        <w:lastRenderedPageBreak/>
         <w:t>NetworkPolicy</w:t>
       </w:r>
       <w:proofErr w:type="spellEnd"/>
@@ -15554,23 +15178,13 @@
           <w:szCs w:val="28"/>
         </w:rPr>
       </w:pPr>
-      <w:proofErr w:type="gramStart"/>
-      <w:r>
-        <w:rPr>
-          <w:rFonts w:asciiTheme="majorBidi" w:hAnsiTheme="majorBidi" w:cstheme="majorBidi"/>
-          <w:sz w:val="28"/>
-          <w:szCs w:val="28"/>
-        </w:rPr>
-        <w:t>So</w:t>
-      </w:r>
-      <w:proofErr w:type="gramEnd"/>
-      <w:r>
-        <w:rPr>
-          <w:rFonts w:asciiTheme="majorBidi" w:hAnsiTheme="majorBidi" w:cstheme="majorBidi"/>
-          <w:sz w:val="28"/>
-          <w:szCs w:val="28"/>
-        </w:rPr>
-        <w:t xml:space="preserve"> enforcement happens inside the node kernel.</w:t>
+      <w:r>
+        <w:rPr>
+          <w:rFonts w:asciiTheme="majorBidi" w:hAnsiTheme="majorBidi" w:cstheme="majorBidi"/>
+          <w:sz w:val="28"/>
+          <w:szCs w:val="28"/>
+        </w:rPr>
+        <w:t>So enforcement happens inside the node kernel.</w:t>
       </w:r>
     </w:p>
     <w:p>
@@ -15698,6 +15312,7 @@
           <w:sz w:val="28"/>
           <w:szCs w:val="28"/>
         </w:rPr>
+        <w:lastRenderedPageBreak/>
         <w:t>Policy B allows:</w:t>
       </w:r>
     </w:p>
@@ -15924,7 +15539,6 @@
           <w:sz w:val="28"/>
           <w:szCs w:val="28"/>
         </w:rPr>
-        <w:lastRenderedPageBreak/>
         <w:t>UDP 53</w:t>
       </w:r>
     </w:p>
@@ -16645,6 +16259,7 @@
           <w:sz w:val="28"/>
           <w:szCs w:val="28"/>
         </w:rPr>
+        <w:lastRenderedPageBreak/>
         <w:t>allow API only</w:t>
       </w:r>
     </w:p>
@@ -17033,7 +16648,6 @@
                 <w:sz w:val="28"/>
                 <w:szCs w:val="28"/>
               </w:rPr>
-              <w:lastRenderedPageBreak/>
               <w:t>Handles</w:t>
             </w:r>
           </w:p>
@@ -17836,6 +17450,7 @@
           <w:sz w:val="28"/>
           <w:szCs w:val="28"/>
         </w:rPr>
+        <w:lastRenderedPageBreak/>
         <w:t xml:space="preserve">Check policies → </w:t>
       </w:r>
       <w:proofErr w:type="spellStart"/>
@@ -18001,9 +17616,148 @@
           <w:sz w:val="28"/>
           <w:szCs w:val="28"/>
         </w:rPr>
-        <w:t xml:space="preserve"> exec -it </w:t>
-      </w:r>
-      <w:proofErr w:type="gramStart"/>
+        <w:t xml:space="preserve"> exec -it pod -- curl service</w:t>
+      </w:r>
+    </w:p>
+    <w:p>
+      <w:pPr>
+        <w:spacing w:after="60"/>
+        <w:rPr>
+          <w:rFonts w:asciiTheme="majorBidi" w:hAnsiTheme="majorBidi" w:cstheme="majorBidi"/>
+          <w:b/>
+          <w:bCs/>
+          <w:sz w:val="32"/>
+          <w:szCs w:val="32"/>
+        </w:rPr>
+      </w:pPr>
+      <w:r>
+        <w:rPr>
+          <w:rFonts w:asciiTheme="majorBidi" w:hAnsiTheme="majorBidi" w:cstheme="majorBidi"/>
+          <w:b/>
+          <w:bCs/>
+          <w:sz w:val="32"/>
+          <w:szCs w:val="32"/>
+        </w:rPr>
+        <w:t>Mental Model</w:t>
+      </w:r>
+    </w:p>
+    <w:p>
+      <w:pPr>
+        <w:rPr>
+          <w:rFonts w:asciiTheme="majorBidi" w:hAnsiTheme="majorBidi" w:cstheme="majorBidi"/>
+          <w:sz w:val="28"/>
+          <w:szCs w:val="28"/>
+        </w:rPr>
+      </w:pPr>
+      <w:r>
+        <w:rPr>
+          <w:rFonts w:asciiTheme="majorBidi" w:hAnsiTheme="majorBidi" w:cstheme="majorBidi"/>
+          <w:sz w:val="28"/>
+          <w:szCs w:val="28"/>
+        </w:rPr>
+        <w:t xml:space="preserve">Think of </w:t>
+      </w:r>
+      <w:proofErr w:type="spellStart"/>
+      <w:r>
+        <w:rPr>
+          <w:rFonts w:asciiTheme="majorBidi" w:hAnsiTheme="majorBidi" w:cstheme="majorBidi"/>
+          <w:sz w:val="28"/>
+          <w:szCs w:val="28"/>
+        </w:rPr>
+        <w:t>NetworkPolicy</w:t>
+      </w:r>
+      <w:proofErr w:type="spellEnd"/>
+      <w:r>
+        <w:rPr>
+          <w:rFonts w:asciiTheme="majorBidi" w:hAnsiTheme="majorBidi" w:cstheme="majorBidi"/>
+          <w:sz w:val="28"/>
+          <w:szCs w:val="28"/>
+        </w:rPr>
+        <w:t xml:space="preserve"> as:</w:t>
+      </w:r>
+    </w:p>
+    <w:p>
+      <w:pPr>
+        <w:spacing w:after="120"/>
+        <w:rPr>
+          <w:rFonts w:asciiTheme="majorBidi" w:hAnsiTheme="majorBidi" w:cstheme="majorBidi"/>
+          <w:sz w:val="28"/>
+          <w:szCs w:val="28"/>
+        </w:rPr>
+      </w:pPr>
+      <w:r>
+        <w:rPr>
+          <w:rFonts w:asciiTheme="majorBidi" w:hAnsiTheme="majorBidi" w:cstheme="majorBidi"/>
+          <w:sz w:val="28"/>
+          <w:szCs w:val="28"/>
+        </w:rPr>
+        <w:t>iptables firewall</w:t>
+      </w:r>
+      <w:r>
+        <w:rPr>
+          <w:rFonts w:asciiTheme="majorBidi" w:hAnsiTheme="majorBidi" w:cstheme="majorBidi"/>
+          <w:sz w:val="28"/>
+          <w:szCs w:val="28"/>
+        </w:rPr>
+        <w:t xml:space="preserve"> </w:t>
+      </w:r>
+      <w:r>
+        <w:rPr>
+          <w:rFonts w:asciiTheme="majorBidi" w:hAnsiTheme="majorBidi" w:cstheme="majorBidi"/>
+          <w:sz w:val="28"/>
+          <w:szCs w:val="28"/>
+        </w:rPr>
+        <w:t>but defined using Kubernetes labels</w:t>
+      </w:r>
+      <w:r>
+        <w:rPr>
+          <w:rFonts w:asciiTheme="majorBidi" w:hAnsiTheme="majorBidi" w:cstheme="majorBidi"/>
+          <w:sz w:val="28"/>
+          <w:szCs w:val="28"/>
+        </w:rPr>
+        <w:t xml:space="preserve"> </w:t>
+      </w:r>
+      <w:r>
+        <w:rPr>
+          <w:rFonts w:asciiTheme="majorBidi" w:hAnsiTheme="majorBidi" w:cstheme="majorBidi"/>
+          <w:sz w:val="28"/>
+          <w:szCs w:val="28"/>
+        </w:rPr>
+        <w:t>and automatically updated</w:t>
+      </w:r>
+    </w:p>
+    <w:p>
+      <w:pPr>
+        <w:spacing w:after="60"/>
+        <w:rPr>
+          <w:rFonts w:asciiTheme="majorBidi" w:hAnsiTheme="majorBidi" w:cstheme="majorBidi"/>
+          <w:b/>
+          <w:bCs/>
+          <w:sz w:val="32"/>
+          <w:szCs w:val="32"/>
+        </w:rPr>
+      </w:pPr>
+      <w:r>
+        <w:rPr>
+          <w:rFonts w:asciiTheme="majorBidi" w:hAnsiTheme="majorBidi" w:cstheme="majorBidi"/>
+          <w:b/>
+          <w:bCs/>
+          <w:sz w:val="32"/>
+          <w:szCs w:val="32"/>
+        </w:rPr>
+        <w:t>Summary:</w:t>
+      </w:r>
+    </w:p>
+    <w:p>
+      <w:pPr>
+        <w:spacing w:after="60"/>
+        <w:rPr>
+          <w:rFonts w:asciiTheme="majorBidi" w:hAnsiTheme="majorBidi" w:cstheme="majorBidi"/>
+          <w:sz w:val="28"/>
+          <w:szCs w:val="28"/>
+        </w:rPr>
+      </w:pPr>
+      <w:proofErr w:type="spellStart"/>
       <w:r>
         <w:rPr>
           <w:rFonts w:asciiTheme="majorBidi" w:hAnsiTheme="majorBidi" w:cstheme="majorBidi"/>
@@ -18014,172 +17768,6 @@
           <w:sz w:val="28"/>
           <w:szCs w:val="28"/>
         </w:rPr>
-        <w:t>pod</w:t>
-      </w:r>
-      <w:proofErr w:type="gramEnd"/>
-      <w:r>
-        <w:rPr>
-          <w:rFonts w:asciiTheme="majorBidi" w:hAnsiTheme="majorBidi" w:cstheme="majorBidi"/>
-          <w:b/>
-          <w:bCs/>
-          <w:i/>
-          <w:iCs/>
-          <w:sz w:val="28"/>
-          <w:szCs w:val="28"/>
-        </w:rPr>
-        <w:t xml:space="preserve"> -- curl service</w:t>
-      </w:r>
-    </w:p>
-    <w:p>
-      <w:pPr>
-        <w:spacing w:after="60"/>
-        <w:rPr>
-          <w:rFonts w:asciiTheme="majorBidi" w:hAnsiTheme="majorBidi" w:cstheme="majorBidi"/>
-          <w:b/>
-          <w:bCs/>
-          <w:sz w:val="32"/>
-          <w:szCs w:val="32"/>
-        </w:rPr>
-      </w:pPr>
-      <w:r>
-        <w:rPr>
-          <w:rFonts w:asciiTheme="majorBidi" w:hAnsiTheme="majorBidi" w:cstheme="majorBidi"/>
-          <w:b/>
-          <w:bCs/>
-          <w:sz w:val="32"/>
-          <w:szCs w:val="32"/>
-        </w:rPr>
-        <w:t>Mental Model</w:t>
-      </w:r>
-    </w:p>
-    <w:p>
-      <w:pPr>
-        <w:rPr>
-          <w:rFonts w:asciiTheme="majorBidi" w:hAnsiTheme="majorBidi" w:cstheme="majorBidi"/>
-          <w:sz w:val="28"/>
-          <w:szCs w:val="28"/>
-        </w:rPr>
-      </w:pPr>
-      <w:r>
-        <w:rPr>
-          <w:rFonts w:asciiTheme="majorBidi" w:hAnsiTheme="majorBidi" w:cstheme="majorBidi"/>
-          <w:sz w:val="28"/>
-          <w:szCs w:val="28"/>
-        </w:rPr>
-        <w:t xml:space="preserve">Think of </w:t>
-      </w:r>
-      <w:proofErr w:type="spellStart"/>
-      <w:r>
-        <w:rPr>
-          <w:rFonts w:asciiTheme="majorBidi" w:hAnsiTheme="majorBidi" w:cstheme="majorBidi"/>
-          <w:sz w:val="28"/>
-          <w:szCs w:val="28"/>
-        </w:rPr>
-        <w:t>NetworkPolicy</w:t>
-      </w:r>
-      <w:proofErr w:type="spellEnd"/>
-      <w:r>
-        <w:rPr>
-          <w:rFonts w:asciiTheme="majorBidi" w:hAnsiTheme="majorBidi" w:cstheme="majorBidi"/>
-          <w:sz w:val="28"/>
-          <w:szCs w:val="28"/>
-        </w:rPr>
-        <w:t xml:space="preserve"> as:</w:t>
-      </w:r>
-    </w:p>
-    <w:p>
-      <w:pPr>
-        <w:spacing w:after="120"/>
-        <w:rPr>
-          <w:rFonts w:asciiTheme="majorBidi" w:hAnsiTheme="majorBidi" w:cstheme="majorBidi"/>
-          <w:sz w:val="28"/>
-          <w:szCs w:val="28"/>
-        </w:rPr>
-      </w:pPr>
-      <w:r>
-        <w:rPr>
-          <w:rFonts w:asciiTheme="majorBidi" w:hAnsiTheme="majorBidi" w:cstheme="majorBidi"/>
-          <w:sz w:val="28"/>
-          <w:szCs w:val="28"/>
-        </w:rPr>
-        <w:t>iptables firewall</w:t>
-      </w:r>
-      <w:r>
-        <w:rPr>
-          <w:rFonts w:asciiTheme="majorBidi" w:hAnsiTheme="majorBidi" w:cstheme="majorBidi"/>
-          <w:sz w:val="28"/>
-          <w:szCs w:val="28"/>
-        </w:rPr>
-        <w:t xml:space="preserve"> </w:t>
-      </w:r>
-      <w:r>
-        <w:rPr>
-          <w:rFonts w:asciiTheme="majorBidi" w:hAnsiTheme="majorBidi" w:cstheme="majorBidi"/>
-          <w:sz w:val="28"/>
-          <w:szCs w:val="28"/>
-        </w:rPr>
-        <w:t>but defined using Kubernetes labels</w:t>
-      </w:r>
-      <w:r>
-        <w:rPr>
-          <w:rFonts w:asciiTheme="majorBidi" w:hAnsiTheme="majorBidi" w:cstheme="majorBidi"/>
-          <w:sz w:val="28"/>
-          <w:szCs w:val="28"/>
-        </w:rPr>
-        <w:t xml:space="preserve"> </w:t>
-      </w:r>
-      <w:r>
-        <w:rPr>
-          <w:rFonts w:asciiTheme="majorBidi" w:hAnsiTheme="majorBidi" w:cstheme="majorBidi"/>
-          <w:sz w:val="28"/>
-          <w:szCs w:val="28"/>
-        </w:rPr>
-        <w:t>and automatically updated</w:t>
-      </w:r>
-    </w:p>
-    <w:p>
-      <w:pPr>
-        <w:spacing w:after="60"/>
-        <w:rPr>
-          <w:rFonts w:asciiTheme="majorBidi" w:hAnsiTheme="majorBidi" w:cstheme="majorBidi"/>
-          <w:b/>
-          <w:bCs/>
-          <w:sz w:val="32"/>
-          <w:szCs w:val="32"/>
-        </w:rPr>
-      </w:pPr>
-      <w:r>
-        <w:rPr>
-          <w:rFonts w:asciiTheme="majorBidi" w:hAnsiTheme="majorBidi" w:cstheme="majorBidi"/>
-          <w:b/>
-          <w:bCs/>
-          <w:sz w:val="32"/>
-          <w:szCs w:val="32"/>
-        </w:rPr>
-        <w:t>Summary:</w:t>
-      </w:r>
-    </w:p>
-    <w:p>
-      <w:pPr>
-        <w:spacing w:after="60"/>
-        <w:rPr>
-          <w:rFonts w:asciiTheme="majorBidi" w:hAnsiTheme="majorBidi" w:cstheme="majorBidi"/>
-          <w:sz w:val="28"/>
-          <w:szCs w:val="28"/>
-        </w:rPr>
-      </w:pPr>
-      <w:proofErr w:type="spellStart"/>
-      <w:r>
-        <w:rPr>
-          <w:rFonts w:asciiTheme="majorBidi" w:hAnsiTheme="majorBidi" w:cstheme="majorBidi"/>
-          <w:b/>
-          <w:bCs/>
-          <w:i/>
-          <w:iCs/>
-          <w:sz w:val="28"/>
-          <w:szCs w:val="28"/>
-        </w:rPr>
-        <w:lastRenderedPageBreak/>
         <w:t>NetworkPolicy</w:t>
       </w:r>
       <w:proofErr w:type="spellEnd"/>
@@ -18350,18 +17938,8 @@
           <w:sz w:val="28"/>
           <w:szCs w:val="28"/>
         </w:rPr>
-        <w:t xml:space="preserve">default </w:t>
-      </w:r>
-      <w:proofErr w:type="gramStart"/>
-      <w:r>
-        <w:rPr>
-          <w:rFonts w:asciiTheme="majorBidi" w:hAnsiTheme="majorBidi" w:cstheme="majorBidi"/>
-          <w:sz w:val="28"/>
-          <w:szCs w:val="28"/>
-        </w:rPr>
-        <w:t>allow</w:t>
-      </w:r>
-      <w:proofErr w:type="gramEnd"/>
+        <w:t>default allow</w:t>
+      </w:r>
     </w:p>
     <w:p>
       <w:pPr>
@@ -18579,6 +18157,7 @@
           <w:sz w:val="28"/>
           <w:szCs w:val="28"/>
         </w:rPr>
+        <w:lastRenderedPageBreak/>
         <w:t>What the Kubernetes networking model requires</w:t>
       </w:r>
     </w:p>
@@ -18780,7 +18359,6 @@
           <w:sz w:val="28"/>
           <w:szCs w:val="28"/>
         </w:rPr>
-        <w:lastRenderedPageBreak/>
         <w:t>Service Networking</w:t>
       </w:r>
     </w:p>
@@ -19263,7 +18841,6 @@
           <w:szCs w:val="28"/>
         </w:rPr>
       </w:pPr>
-      <w:proofErr w:type="spellStart"/>
       <w:r>
         <w:rPr>
           <w:rFonts w:asciiTheme="majorBidi" w:hAnsiTheme="majorBidi" w:cstheme="majorBidi"/>
@@ -19272,7 +18849,6 @@
         </w:rPr>
         <w:t>ExternalName</w:t>
       </w:r>
-      <w:proofErr w:type="spellEnd"/>
     </w:p>
     <w:p>
       <w:pPr>
@@ -28080,7 +27656,6 @@
   <w:style w:type="character" w:default="1" w:styleId="DefaultParagraphFont">
     <w:name w:val="Default Paragraph Font"/>
     <w:uiPriority w:val="1"/>
-    <w:semiHidden/>
     <w:unhideWhenUsed/>
   </w:style>
   <w:style w:type="table" w:default="1" w:styleId="TableNormal">

</xml_diff>